<commit_message>
New file lab9.cpp and changes in otchet.docx
</commit_message>
<xml_diff>
--- a/Otchet.docx
+++ b/Otchet.docx
@@ -4,17 +4,536 @@
   <w:body>
     <w:p>
       <w:pPr>
-        <w:rPr>
-          <w:lang w:val="en-US"/>
-        </w:rPr>
-      </w:pPr>
-      <w:r>
-        <w:rPr>
-          <w:lang w:val="en-US"/>
-        </w:rPr>
-        <w:t>21212</w:t>
-      </w:r>
-    </w:p>
+        <w:jc w:val="center"/>
+      </w:pPr>
+      <w:r>
+        <w:t>ФГБОУ ВО «Пензенский государственный университет»</w:t>
+      </w:r>
+    </w:p>
+    <w:p>
+      <w:pPr>
+        <w:jc w:val="center"/>
+      </w:pPr>
+      <w:r>
+        <w:t>Факультет вычислительной техники</w:t>
+      </w:r>
+      <w:r>
+        <w:br/>
+        <w:t>  Кафедра «Вычислительная техника»</w:t>
+      </w:r>
+    </w:p>
+    <w:p>
+      <w:pPr>
+        <w:jc w:val="center"/>
+      </w:pPr>
+    </w:p>
+    <w:p>
+      <w:pPr>
+        <w:jc w:val="center"/>
+      </w:pPr>
+    </w:p>
+    <w:p>
+      <w:pPr>
+        <w:jc w:val="center"/>
+      </w:pPr>
+    </w:p>
+    <w:p>
+      <w:pPr>
+        <w:jc w:val="center"/>
+      </w:pPr>
+    </w:p>
+    <w:p>
+      <w:pPr>
+        <w:jc w:val="center"/>
+      </w:pPr>
+    </w:p>
+    <w:p>
+      <w:pPr>
+        <w:jc w:val="center"/>
+      </w:pPr>
+    </w:p>
+    <w:p>
+      <w:pPr>
+        <w:jc w:val="center"/>
+      </w:pPr>
+    </w:p>
+    <w:p>
+      <w:pPr>
+        <w:jc w:val="center"/>
+      </w:pPr>
+      <w:r>
+        <w:t>ОТЧЕТ</w:t>
+      </w:r>
+    </w:p>
+    <w:p>
+      <w:pPr>
+        <w:jc w:val="center"/>
+      </w:pPr>
+      <w:r>
+        <w:t>по лабораторной работе №</w:t>
+      </w:r>
+      <w:r>
+        <w:t>9</w:t>
+      </w:r>
+    </w:p>
+    <w:p>
+      <w:pPr>
+        <w:jc w:val="center"/>
+      </w:pPr>
+      <w:r>
+        <w:t>по дисциплине «Информационные технологии в профессиональной деятельности»</w:t>
+      </w:r>
+    </w:p>
+    <w:p>
+      <w:pPr>
+        <w:jc w:val="center"/>
+      </w:pPr>
+      <w:r>
+        <w:t>на тему «</w:t>
+      </w:r>
+      <w:r>
+        <w:t>GitHub. Совместная работа</w:t>
+      </w:r>
+      <w:r>
+        <w:t>»</w:t>
+      </w:r>
+    </w:p>
+    <w:p>
+      <w:r>
+        <w:t> </w:t>
+      </w:r>
+    </w:p>
+    <w:p>
+      <w:r>
+        <w:t> </w:t>
+      </w:r>
+    </w:p>
+    <w:p>
+      <w:r>
+        <w:t> </w:t>
+      </w:r>
+    </w:p>
+    <w:p>
+      <w:r>
+        <w:t> </w:t>
+      </w:r>
+    </w:p>
+    <w:p>
+      <w:r>
+        <w:t> </w:t>
+      </w:r>
+    </w:p>
+    <w:p>
+      <w:pPr>
+        <w:jc w:val="right"/>
+      </w:pPr>
+      <w:r>
+        <w:t>Выполнил студент группы 25ВВВ3:</w:t>
+      </w:r>
+    </w:p>
+    <w:p>
+      <w:pPr>
+        <w:jc w:val="right"/>
+      </w:pPr>
+      <w:r>
+        <w:t>Волков И.Р.</w:t>
+      </w:r>
+    </w:p>
+    <w:p>
+      <w:pPr>
+        <w:jc w:val="right"/>
+      </w:pPr>
+      <w:r>
+        <w:t>Итянина В.А.</w:t>
+      </w:r>
+    </w:p>
+    <w:p>
+      <w:pPr>
+        <w:jc w:val="right"/>
+      </w:pPr>
+      <w:r>
+        <w:t>Юткина В.А.</w:t>
+      </w:r>
+    </w:p>
+    <w:p>
+      <w:pPr>
+        <w:jc w:val="right"/>
+      </w:pPr>
+      <w:r>
+        <w:t> </w:t>
+      </w:r>
+    </w:p>
+    <w:p>
+      <w:pPr>
+        <w:jc w:val="right"/>
+      </w:pPr>
+      <w:r>
+        <w:t>Приняли:</w:t>
+      </w:r>
+    </w:p>
+    <w:p>
+      <w:pPr>
+        <w:jc w:val="right"/>
+      </w:pPr>
+      <w:r>
+        <w:t>Юрова О.В.</w:t>
+      </w:r>
+    </w:p>
+    <w:p>
+      <w:pPr>
+        <w:jc w:val="right"/>
+      </w:pPr>
+      <w:r>
+        <w:t>Митрохина  Н.Ю.</w:t>
+      </w:r>
+    </w:p>
+    <w:p>
+      <w:r>
+        <w:t> </w:t>
+      </w:r>
+    </w:p>
+    <w:p>
+      <w:r>
+        <w:t> </w:t>
+      </w:r>
+    </w:p>
+    <w:p>
+      <w:r>
+        <w:br w:type="page"/>
+      </w:r>
+      <w:r>
+        <w:lastRenderedPageBreak/>
+        <w:t> </w:t>
+      </w:r>
+    </w:p>
+    <w:p>
+      <w:r>
+        <w:t xml:space="preserve">Цель работы: научиться работать с веб-сервисом для хостинга проектов и их совместной разработки GitHub. Создать свой публичный репозиторий. </w:t>
+      </w:r>
+    </w:p>
+    <w:p>
+      <w:r>
+        <w:t>1) Регистрация всех членов команды.</w:t>
+      </w:r>
+    </w:p>
+    <w:p>
+      <w:r>
+        <w:t>Все участники проекта зарегистрировались.</w:t>
+      </w:r>
+    </w:p>
+    <w:p>
+      <w:r>
+        <w:t>2) Распределение ролей на проекте.</w:t>
+      </w:r>
+    </w:p>
+    <w:p>
+      <w:r>
+        <w:t>студент №1 – Волков</w:t>
+      </w:r>
+    </w:p>
+    <w:p>
+      <w:r>
+        <w:t>студент №2 –</w:t>
+      </w:r>
+    </w:p>
+    <w:p>
+      <w:r>
+        <w:t>студент №3 –</w:t>
+      </w:r>
+    </w:p>
+    <w:p>
+      <w:r>
+        <w:t xml:space="preserve">3) Создание совместного репозитория </w:t>
+      </w:r>
+    </w:p>
+    <w:p>
+      <w:r>
+        <w:t>Создал в своей учетной записи новый публичный репозиторий FinalWork. Добавил к этому репозиторию соавторов.</w:t>
+      </w:r>
+    </w:p>
+    <w:p>
+      <w:r>
+        <w:drawing>
+          <wp:inline distT="0" distB="0" distL="0" distR="0" wp14:anchorId="47650A51" wp14:editId="4AAEA931">
+            <wp:extent cx="5829300" cy="3076575"/>
+            <wp:effectExtent l="0" t="0" r="0" b="9525"/>
+            <wp:docPr id="10" name="Рисунок 10"/>
+            <wp:cNvGraphicFramePr>
+              <a:graphicFrameLocks xmlns:a="http://schemas.openxmlformats.org/drawingml/2006/main" noChangeAspect="1"/>
+            </wp:cNvGraphicFramePr>
+            <a:graphic xmlns:a="http://schemas.openxmlformats.org/drawingml/2006/main">
+              <a:graphicData uri="http://schemas.openxmlformats.org/drawingml/2006/picture">
+                <pic:pic xmlns:pic="http://schemas.openxmlformats.org/drawingml/2006/picture">
+                  <pic:nvPicPr>
+                    <pic:cNvPr id="0" name="Picture 26"/>
+                    <pic:cNvPicPr>
+                      <a:picLocks noChangeAspect="1" noChangeArrowheads="1"/>
+                    </pic:cNvPicPr>
+                  </pic:nvPicPr>
+                  <pic:blipFill>
+                    <a:blip r:embed="rId4" cstate="print">
+                      <a:extLst>
+                        <a:ext uri="{28A0092B-C50C-407E-A947-70E740481C1C}">
+                          <a14:useLocalDpi xmlns:a14="http://schemas.microsoft.com/office/drawing/2010/main" val="0"/>
+                        </a:ext>
+                      </a:extLst>
+                    </a:blip>
+                    <a:srcRect/>
+                    <a:stretch>
+                      <a:fillRect/>
+                    </a:stretch>
+                  </pic:blipFill>
+                  <pic:spPr bwMode="auto">
+                    <a:xfrm>
+                      <a:off x="0" y="0"/>
+                      <a:ext cx="5829300" cy="3076575"/>
+                    </a:xfrm>
+                    <a:prstGeom prst="rect">
+                      <a:avLst/>
+                    </a:prstGeom>
+                    <a:noFill/>
+                    <a:ln>
+                      <a:noFill/>
+                    </a:ln>
+                  </pic:spPr>
+                </pic:pic>
+              </a:graphicData>
+            </a:graphic>
+          </wp:inline>
+        </w:drawing>
+      </w:r>
+    </w:p>
+    <w:p>
+      <w:r>
+        <w:lastRenderedPageBreak/>
+        <w:drawing>
+          <wp:inline distT="0" distB="0" distL="0" distR="0" wp14:anchorId="0A499F32" wp14:editId="469CA009">
+            <wp:extent cx="5940425" cy="3103245"/>
+            <wp:effectExtent l="0" t="0" r="3175" b="1905"/>
+            <wp:docPr id="9" name="Рисунок 9"/>
+            <wp:cNvGraphicFramePr>
+              <a:graphicFrameLocks xmlns:a="http://schemas.openxmlformats.org/drawingml/2006/main" noChangeAspect="1"/>
+            </wp:cNvGraphicFramePr>
+            <a:graphic xmlns:a="http://schemas.openxmlformats.org/drawingml/2006/main">
+              <a:graphicData uri="http://schemas.openxmlformats.org/drawingml/2006/picture">
+                <pic:pic xmlns:pic="http://schemas.openxmlformats.org/drawingml/2006/picture">
+                  <pic:nvPicPr>
+                    <pic:cNvPr id="0" name="Picture 27"/>
+                    <pic:cNvPicPr>
+                      <a:picLocks noChangeAspect="1" noChangeArrowheads="1"/>
+                    </pic:cNvPicPr>
+                  </pic:nvPicPr>
+                  <pic:blipFill>
+                    <a:blip r:embed="rId5">
+                      <a:extLst>
+                        <a:ext uri="{28A0092B-C50C-407E-A947-70E740481C1C}">
+                          <a14:useLocalDpi xmlns:a14="http://schemas.microsoft.com/office/drawing/2010/main" val="0"/>
+                        </a:ext>
+                      </a:extLst>
+                    </a:blip>
+                    <a:srcRect/>
+                    <a:stretch>
+                      <a:fillRect/>
+                    </a:stretch>
+                  </pic:blipFill>
+                  <pic:spPr bwMode="auto">
+                    <a:xfrm>
+                      <a:off x="0" y="0"/>
+                      <a:ext cx="5940425" cy="3103245"/>
+                    </a:xfrm>
+                    <a:prstGeom prst="rect">
+                      <a:avLst/>
+                    </a:prstGeom>
+                    <a:noFill/>
+                    <a:ln>
+                      <a:noFill/>
+                    </a:ln>
+                  </pic:spPr>
+                </pic:pic>
+              </a:graphicData>
+            </a:graphic>
+          </wp:inline>
+        </w:drawing>
+      </w:r>
+    </w:p>
+    <w:p>
+      <w:r>
+        <w:drawing>
+          <wp:inline distT="0" distB="0" distL="0" distR="0" wp14:anchorId="456CE581" wp14:editId="358D53EB">
+            <wp:extent cx="5940425" cy="3231515"/>
+            <wp:effectExtent l="0" t="0" r="3175" b="6985"/>
+            <wp:docPr id="8" name="Рисунок 8"/>
+            <wp:cNvGraphicFramePr>
+              <a:graphicFrameLocks xmlns:a="http://schemas.openxmlformats.org/drawingml/2006/main" noChangeAspect="1"/>
+            </wp:cNvGraphicFramePr>
+            <a:graphic xmlns:a="http://schemas.openxmlformats.org/drawingml/2006/main">
+              <a:graphicData uri="http://schemas.openxmlformats.org/drawingml/2006/picture">
+                <pic:pic xmlns:pic="http://schemas.openxmlformats.org/drawingml/2006/picture">
+                  <pic:nvPicPr>
+                    <pic:cNvPr id="0" name="Picture 28"/>
+                    <pic:cNvPicPr>
+                      <a:picLocks noChangeAspect="1" noChangeArrowheads="1"/>
+                    </pic:cNvPicPr>
+                  </pic:nvPicPr>
+                  <pic:blipFill>
+                    <a:blip r:embed="rId6">
+                      <a:extLst>
+                        <a:ext uri="{28A0092B-C50C-407E-A947-70E740481C1C}">
+                          <a14:useLocalDpi xmlns:a14="http://schemas.microsoft.com/office/drawing/2010/main" val="0"/>
+                        </a:ext>
+                      </a:extLst>
+                    </a:blip>
+                    <a:srcRect/>
+                    <a:stretch>
+                      <a:fillRect/>
+                    </a:stretch>
+                  </pic:blipFill>
+                  <pic:spPr bwMode="auto">
+                    <a:xfrm>
+                      <a:off x="0" y="0"/>
+                      <a:ext cx="5940425" cy="3231515"/>
+                    </a:xfrm>
+                    <a:prstGeom prst="rect">
+                      <a:avLst/>
+                    </a:prstGeom>
+                    <a:noFill/>
+                    <a:ln>
+                      <a:noFill/>
+                    </a:ln>
+                  </pic:spPr>
+                </pic:pic>
+              </a:graphicData>
+            </a:graphic>
+          </wp:inline>
+        </w:drawing>
+      </w:r>
+    </w:p>
+    <w:p>
+      <w:r>
+        <w:drawing>
+          <wp:inline distT="0" distB="0" distL="0" distR="0" wp14:anchorId="7DAD635F" wp14:editId="74C1AD41">
+            <wp:extent cx="5940425" cy="2608580"/>
+            <wp:effectExtent l="0" t="0" r="3175" b="1270"/>
+            <wp:docPr id="7" name="Рисунок 7"/>
+            <wp:cNvGraphicFramePr>
+              <a:graphicFrameLocks xmlns:a="http://schemas.openxmlformats.org/drawingml/2006/main" noChangeAspect="1"/>
+            </wp:cNvGraphicFramePr>
+            <a:graphic xmlns:a="http://schemas.openxmlformats.org/drawingml/2006/main">
+              <a:graphicData uri="http://schemas.openxmlformats.org/drawingml/2006/picture">
+                <pic:pic xmlns:pic="http://schemas.openxmlformats.org/drawingml/2006/picture">
+                  <pic:nvPicPr>
+                    <pic:cNvPr id="0" name="Picture 29"/>
+                    <pic:cNvPicPr>
+                      <a:picLocks noChangeAspect="1" noChangeArrowheads="1"/>
+                    </pic:cNvPicPr>
+                  </pic:nvPicPr>
+                  <pic:blipFill>
+                    <a:blip r:embed="rId7">
+                      <a:extLst>
+                        <a:ext uri="{28A0092B-C50C-407E-A947-70E740481C1C}">
+                          <a14:useLocalDpi xmlns:a14="http://schemas.microsoft.com/office/drawing/2010/main" val="0"/>
+                        </a:ext>
+                      </a:extLst>
+                    </a:blip>
+                    <a:srcRect/>
+                    <a:stretch>
+                      <a:fillRect/>
+                    </a:stretch>
+                  </pic:blipFill>
+                  <pic:spPr bwMode="auto">
+                    <a:xfrm>
+                      <a:off x="0" y="0"/>
+                      <a:ext cx="5940425" cy="2608580"/>
+                    </a:xfrm>
+                    <a:prstGeom prst="rect">
+                      <a:avLst/>
+                    </a:prstGeom>
+                    <a:noFill/>
+                    <a:ln>
+                      <a:noFill/>
+                    </a:ln>
+                  </pic:spPr>
+                </pic:pic>
+              </a:graphicData>
+            </a:graphic>
+          </wp:inline>
+        </w:drawing>
+      </w:r>
+    </w:p>
+    <w:p>
+      <w:r>
+        <w:lastRenderedPageBreak/>
+        <w:t>4) Выполнение задания.</w:t>
+      </w:r>
+    </w:p>
+    <w:p>
+      <w:r>
+        <w:t>Этап 1.</w:t>
+      </w:r>
+    </w:p>
+    <w:p>
+      <w:r>
+        <w:t>Создал локальный репозиторий и инициализировал его. Свяжал созданный репозиторий с удаленным (FinalWork). Убедился в том, что привязка прошла успешно, выполнив соответствующую команду. Извлек и загрузил в локальный репозиторий содержимое из удаленного репозитория.</w:t>
+      </w:r>
+    </w:p>
+    <w:p>
+      <w:r>
+        <w:drawing>
+          <wp:inline distT="0" distB="0" distL="0" distR="0" wp14:anchorId="7FCA27B9" wp14:editId="646C7A38">
+            <wp:extent cx="5353050" cy="5534025"/>
+            <wp:effectExtent l="0" t="0" r="0" b="9525"/>
+            <wp:docPr id="6" name="Рисунок 6"/>
+            <wp:cNvGraphicFramePr>
+              <a:graphicFrameLocks xmlns:a="http://schemas.openxmlformats.org/drawingml/2006/main" noChangeAspect="1"/>
+            </wp:cNvGraphicFramePr>
+            <a:graphic xmlns:a="http://schemas.openxmlformats.org/drawingml/2006/main">
+              <a:graphicData uri="http://schemas.openxmlformats.org/drawingml/2006/picture">
+                <pic:pic xmlns:pic="http://schemas.openxmlformats.org/drawingml/2006/picture">
+                  <pic:nvPicPr>
+                    <pic:cNvPr id="0" name="Picture 30"/>
+                    <pic:cNvPicPr>
+                      <a:picLocks noChangeAspect="1" noChangeArrowheads="1"/>
+                    </pic:cNvPicPr>
+                  </pic:nvPicPr>
+                  <pic:blipFill>
+                    <a:blip r:embed="rId8">
+                      <a:extLst>
+                        <a:ext uri="{28A0092B-C50C-407E-A947-70E740481C1C}">
+                          <a14:useLocalDpi xmlns:a14="http://schemas.microsoft.com/office/drawing/2010/main" val="0"/>
+                        </a:ext>
+                      </a:extLst>
+                    </a:blip>
+                    <a:srcRect/>
+                    <a:stretch>
+                      <a:fillRect/>
+                    </a:stretch>
+                  </pic:blipFill>
+                  <pic:spPr bwMode="auto">
+                    <a:xfrm>
+                      <a:off x="0" y="0"/>
+                      <a:ext cx="5353050" cy="5534025"/>
+                    </a:xfrm>
+                    <a:prstGeom prst="rect">
+                      <a:avLst/>
+                    </a:prstGeom>
+                    <a:noFill/>
+                    <a:ln>
+                      <a:noFill/>
+                    </a:ln>
+                  </pic:spPr>
+                </pic:pic>
+              </a:graphicData>
+            </a:graphic>
+          </wp:inline>
+        </w:drawing>
+      </w:r>
+    </w:p>
+    <w:p>
+      <w:r>
+        <w:t> </w:t>
+      </w:r>
+    </w:p>
+    <w:p/>
     <w:sectPr>
       <w:pgSz w:w="11906" w:h="16838"/>
       <w:pgMar w:top="1134" w:right="850" w:bottom="1134" w:left="1701" w:header="708" w:footer="708" w:gutter="0"/>
@@ -628,7 +1147,6 @@
   <w:style w:type="character" w:default="1" w:styleId="a0">
     <w:name w:val="Default Paragraph Font"/>
     <w:uiPriority w:val="1"/>
-    <w:semiHidden/>
     <w:unhideWhenUsed/>
   </w:style>
   <w:style w:type="table" w:default="1" w:styleId="a1">

</xml_diff>